<commit_message>
sauvegarde du 2026-05-13 17:18:00
</commit_message>
<xml_diff>
--- a/donnée technique/ce que je fais.docx
+++ b/donnée technique/ce que je fais.docx
@@ -12,7 +12,287 @@
         </w:rPr>
       </w:pPr>
       <w:r>
+        <w:rPr>
+          <w:highlight w:val="none"/>
+        </w:rPr>
+        <w:t xml:space="preserve">********************************************************************</w:t>
+      </w:r>
+      <w:r>
+        <w:rPr>
+          <w:highlight w:val="none"/>
+        </w:rPr>
+      </w:r>
+      <w:r>
+        <w:rPr>
+          <w:highlight w:val="none"/>
+        </w:rPr>
+      </w:r>
+    </w:p>
+    <w:p>
+      <w:pPr>
+        <w:pBdr/>
+        <w:spacing/>
+        <w:ind/>
+        <w:rPr>
+          <w:highlight w:val="none"/>
+        </w:rPr>
+      </w:pPr>
+      <w:r>
+        <w:rPr>
+          <w:highlight w:val="none"/>
+        </w:rPr>
+      </w:r>
+      <w:r>
+        <w:rPr>
+          <w:highlight w:val="none"/>
+        </w:rPr>
+        <w:t xml:space="preserve">Sauvegarder dans la BDD le cumule de production pour une heure de la mme journée</w:t>
+      </w:r>
+      <w:r>
+        <w:rPr>
+          <w:highlight w:val="none"/>
+        </w:rPr>
+      </w:r>
+    </w:p>
+    <w:p>
+      <w:pPr>
+        <w:pBdr/>
+        <w:spacing/>
+        <w:ind/>
+        <w:rPr>
+          <w:highlight w:val="none"/>
+        </w:rPr>
+      </w:pPr>
+      <w:r>
+        <w:rPr>
+          <w:highlight w:val="none"/>
+        </w:rPr>
+        <w:t xml:space="preserve">Mais chaque 1h on stocke production réel dans la bdd</w:t>
+      </w:r>
+      <w:r>
+        <w:rPr>
+          <w:highlight w:val="none"/>
+        </w:rPr>
+      </w:r>
+    </w:p>
+    <w:p>
+      <w:pPr>
+        <w:pBdr/>
+        <w:spacing/>
+        <w:ind/>
+        <w:rPr>
+          <w:highlight w:val="none"/>
+        </w:rPr>
+      </w:pPr>
+      <w:r>
+        <w:rPr>
+          <w:highlight w:val="none"/>
+        </w:rPr>
+        <w:t xml:space="preserve">Recalculer la fonction cumule avec les donnée de la BDD</w:t>
+      </w:r>
+      <w:r>
+        <w:rPr>
+          <w:highlight w:val="none"/>
+        </w:rPr>
+      </w:r>
+      <w:r>
+        <w:rPr>
+          <w:highlight w:val="none"/>
+        </w:rPr>
+      </w:r>
+    </w:p>
+    <w:p>
+      <w:pPr>
+        <w:pStyle w:val="668"/>
+        <w:numPr>
+          <w:ilvl w:val="0"/>
+          <w:numId w:val="2"/>
+        </w:numPr>
+        <w:pBdr/>
+        <w:spacing/>
+        <w:ind/>
+        <w:rPr>
+          <w:highlight w:val="none"/>
+        </w:rPr>
+      </w:pPr>
+      <w:r>
+        <w:rPr>
+          <w:highlight w:val="none"/>
+        </w:rPr>
+        <w:t xml:space="preserve">Pourquoi a 0,1 kw nous somme toujours sur le panneau solaire</w:t>
+      </w:r>
+      <w:r>
+        <w:rPr>
+          <w:highlight w:val="none"/>
+        </w:rPr>
+      </w:r>
+    </w:p>
+    <w:p>
+      <w:pPr>
+        <w:pBdr/>
+        <w:spacing/>
+        <w:ind/>
+        <w:rPr>
+          <w:highlight w:val="none"/>
+        </w:rPr>
+      </w:pPr>
+      <w:r>
+        <w:rPr>
+          <w:highlight w:val="none"/>
+        </w:rPr>
+        <w:t xml:space="preserve">********************************************************************</w:t>
+      </w:r>
+      <w:r>
+        <w:rPr>
+          <w:highlight w:val="none"/>
+        </w:rPr>
+      </w:r>
+      <w:r>
+        <w:rPr>
+          <w:highlight w:val="none"/>
+        </w:rPr>
+      </w:r>
+    </w:p>
+    <w:p>
+      <w:pPr>
+        <w:pBdr/>
+        <w:spacing/>
+        <w:ind/>
+        <w:rPr>
+          <w:highlight w:val="none"/>
+        </w:rPr>
+      </w:pPr>
+      <w:r>
+        <w:rPr>
+          <w:highlight w:val="none"/>
+        </w:rPr>
+      </w:r>
+      <w:r>
+        <w:rPr>
+          <w:highlight w:val="none"/>
+        </w:rPr>
+      </w:r>
+      <w:r>
+        <w:rPr>
+          <w:highlight w:val="none"/>
+        </w:rPr>
+      </w:r>
+    </w:p>
+    <w:p>
+      <w:pPr>
+        <w:pBdr/>
+        <w:spacing/>
+        <w:ind/>
+        <w:rPr>
+          <w:highlight w:val="none"/>
+        </w:rPr>
+      </w:pPr>
+      <w:r>
         <w:t xml:space="preserve">Ce que je dois faire :</w:t>
+      </w:r>
+      <w:r>
+        <w:rPr>
+          <w:highlight w:val="none"/>
+        </w:rPr>
+      </w:r>
+    </w:p>
+    <w:p>
+      <w:pPr>
+        <w:pBdr/>
+        <w:spacing/>
+        <w:ind/>
+        <w:rPr>
+          <w:highlight w:val="none"/>
+        </w:rPr>
+      </w:pPr>
+      <w:r>
+        <w:rPr>
+          <w:highlight w:val="none"/>
+        </w:rPr>
+        <w:t xml:space="preserve">Verifier pourquoi j’ai null pour :</w:t>
+      </w:r>
+      <w:r>
+        <w:rPr>
+          <w:highlight w:val="none"/>
+        </w:rPr>
+      </w:r>
+      <w:r>
+        <w:rPr>
+          <w:highlight w:val="none"/>
+        </w:rPr>
+      </w:r>
+    </w:p>
+    <w:p>
+      <w:pPr>
+        <w:pBdr/>
+        <w:spacing/>
+        <w:ind/>
+        <w:rPr>
+          <w:highlight w:val="none"/>
+        </w:rPr>
+      </w:pPr>
+      <w:r>
+        <w:rPr>
+          <w:highlight w:val="none"/>
+        </w:rPr>
+        <w:t xml:space="preserve">En cas de coupure de courant notfier l’utilisateur avec une notifaction dismissable</w:t>
+      </w:r>
+      <w:r>
+        <w:rPr>
+          <w:highlight w:val="none"/>
+        </w:rPr>
+      </w:r>
+      <w:r>
+        <w:rPr>
+          <w:highlight w:val="none"/>
+        </w:rPr>
+      </w:r>
+    </w:p>
+    <w:p>
+      <w:pPr>
+        <w:pBdr/>
+        <w:spacing/>
+        <w:ind/>
+        <w:rPr>
+          <w:highlight w:val="none"/>
+        </w:rPr>
+      </w:pPr>
+      <w:r>
+        <w:rPr>
+          <w:highlight w:val="none"/>
+        </w:rPr>
+        <w:t xml:space="preserve">Ajouter une logique pour voire combien on a consommé sur la SBEE</w:t>
+      </w:r>
+      <w:r>
+        <w:rPr>
+          <w:highlight w:val="none"/>
+        </w:rPr>
+      </w:r>
+      <w:r>
+        <w:rPr>
+          <w:highlight w:val="none"/>
+        </w:rPr>
+      </w:r>
+    </w:p>
+    <w:p>
+      <w:pPr>
+        <w:pBdr/>
+        <w:spacing/>
+        <w:ind/>
+        <w:rPr>
+          <w:highlight w:val="none"/>
+        </w:rPr>
+      </w:pPr>
+      <w:r>
+        <w:rPr>
+          <w:highlight w:val="none"/>
+        </w:rPr>
+        <w:t xml:space="preserve">Récuperer  les prédictions en fonction de données et les stocker dans la base de données</w:t>
+      </w:r>
+      <w:r>
+        <w:rPr>
+          <w:highlight w:val="none"/>
+        </w:rPr>
       </w:r>
       <w:r>
         <w:rPr>
@@ -59,7 +339,70 @@
         <w:rPr>
           <w:highlight w:val="none"/>
         </w:rPr>
-        <w:t xml:space="preserve">Chercher a inclure une logique pour avoir les dernières informations météorologique depuis open météo</w:t>
+        <w:t xml:space="preserve">Créer une variables pour stocker la consommation  de la maison et l’afficher</w:t>
+      </w:r>
+      <w:r>
+        <w:rPr>
+          <w:highlight w:val="none"/>
+        </w:rPr>
+      </w:r>
+    </w:p>
+    <w:p>
+      <w:pPr>
+        <w:pBdr/>
+        <w:spacing/>
+        <w:ind/>
+        <w:rPr>
+          <w:highlight w:val="none"/>
+        </w:rPr>
+      </w:pPr>
+      <w:r>
+        <w:rPr>
+          <w:highlight w:val="none"/>
+        </w:rPr>
+        <w:t xml:space="preserve">**Créer une base de données pour stocker les données</w:t>
+      </w:r>
+      <w:r>
+        <w:rPr>
+          <w:highlight w:val="none"/>
+        </w:rPr>
+      </w:r>
+    </w:p>
+    <w:p>
+      <w:pPr>
+        <w:pBdr/>
+        <w:spacing/>
+        <w:ind/>
+        <w:rPr>
+          <w:highlight w:val="none"/>
+        </w:rPr>
+      </w:pPr>
+      <w:r>
+        <w:rPr>
+          <w:highlight w:val="none"/>
+        </w:rPr>
+        <w:t xml:space="preserve">Ajouter une barre de recherche pour chercher dans l’historique une date précise</w:t>
+      </w:r>
+      <w:r>
+        <w:rPr>
+          <w:highlight w:val="none"/>
+        </w:rPr>
+      </w:r>
+    </w:p>
+    <w:p>
+      <w:pPr>
+        <w:pBdr/>
+        <w:spacing/>
+        <w:ind/>
+        <w:rPr>
+          <w:highlight w:val="none"/>
+        </w:rPr>
+      </w:pPr>
+      <w:r>
+        <w:rPr>
+          <w:highlight w:val="none"/>
+        </w:rPr>
+        <w:t xml:space="preserve">ajouter une option pour ajouter une ou des périodes de delaistage</w:t>
       </w:r>
       <w:r>
         <w:rPr>
@@ -77,6 +420,28 @@
         <w:pBdr/>
         <w:spacing/>
         <w:ind/>
+        <w:rPr/>
+      </w:pPr>
+      <w:r/>
+      <w:r/>
+      <w:r/>
+    </w:p>
+    <w:p>
+      <w:pPr>
+        <w:pBdr/>
+        <w:spacing/>
+        <w:ind/>
+        <w:rPr/>
+      </w:pPr>
+      <w:r/>
+      <w:r/>
+      <w:r/>
+    </w:p>
+    <w:p>
+      <w:pPr>
+        <w:pBdr/>
+        <w:spacing/>
+        <w:ind/>
         <w:rPr>
           <w:highlight w:val="none"/>
         </w:rPr>
@@ -85,19 +450,77 @@
         <w:rPr>
           <w:highlight w:val="none"/>
         </w:rPr>
-        <w:t xml:space="preserve">Créer une variables pour stocker la consommation et la production totale de la maison et l’afficher</w:t>
+        <w:t xml:space="preserve">Ce que je fais actuellement : </w:t>
+      </w:r>
+      <w:r/>
+    </w:p>
+    <w:p>
+      <w:pPr>
+        <w:pBdr/>
+        <w:spacing/>
+        <w:ind/>
+        <w:rPr>
+          <w:highlight w:val="none"/>
+        </w:rPr>
+      </w:pPr>
+      <w:r>
+        <w:rPr>
+          <w:highlight w:val="none"/>
+        </w:rPr>
+        <w:t xml:space="preserve">Ajouter une logique pour calculer combien on a gagner aujourd’hui</w:t>
+      </w:r>
+      <w:r/>
+    </w:p>
+    <w:p>
+      <w:pPr>
+        <w:pStyle w:val="668"/>
+        <w:numPr>
+          <w:ilvl w:val="0"/>
+          <w:numId w:val="1"/>
+        </w:numPr>
+        <w:pBdr/>
+        <w:spacing/>
+        <w:ind/>
+        <w:rPr/>
+      </w:pPr>
+      <w:r>
+        <w:rPr>
+          <w:highlight w:val="none"/>
+        </w:rPr>
+        <w:t xml:space="preserve">Ajouter une option pour savoir a combien la sbee fracture le Kw/h</w:t>
+      </w:r>
+      <w:r/>
+    </w:p>
+    <w:p>
+      <w:pPr>
+        <w:pStyle w:val="668"/>
+        <w:numPr>
+          <w:ilvl w:val="0"/>
+          <w:numId w:val="1"/>
+        </w:numPr>
+        <w:pBdr/>
+        <w:spacing/>
+        <w:ind/>
+        <w:rPr/>
+      </w:pPr>
+      <w:r>
+        <w:rPr>
+          <w:highlight w:val="none"/>
+        </w:rPr>
+        <w:t xml:space="preserve">Pour savoir combien on a épargner en utilisant les sources renouvellable il faut calculer E = p*t autrement dit kw/h, pour cela il faut connaitre la puissance moyenne consommée en une heure sur des sources renouvelable</w:t>
       </w:r>
       <w:r>
         <w:rPr>
           <w:highlight w:val="none"/>
         </w:rPr>
       </w:r>
+      <w:r/>
     </w:p>
     <w:p>
       <w:pPr>
         <w:pBdr/>
         <w:spacing/>
-        <w:ind/>
+        <w:ind w:firstLine="0" w:left="0"/>
         <w:rPr>
           <w:highlight w:val="none"/>
         </w:rPr>
@@ -106,42 +529,257 @@
         <w:rPr>
           <w:highlight w:val="none"/>
         </w:rPr>
-        <w:t xml:space="preserve">Créer une base de données pour stocker les données</w:t>
+        <w:t xml:space="preserve">Créer la fonction neuronal décisions : </w:t>
       </w:r>
       <w:r>
         <w:rPr>
           <w:highlight w:val="none"/>
         </w:rPr>
+        <w:t xml:space="preserve"> la fonction de décision est créée et elle s’appelle houlyStrategy ; et nous envoyons la stratégie toute les 5 secondes au FE</w:t>
       </w:r>
+      <w:r/>
     </w:p>
     <w:p>
       <w:pPr>
         <w:pBdr/>
         <w:spacing/>
-        <w:ind/>
-        <w:rPr>
-          <w:highlight w:val="none"/>
-        </w:rPr>
+        <w:ind w:firstLine="0" w:left="0"/>
+        <w:rPr/>
+      </w:pPr>
+      <w:r/>
+      <w:r/>
+      <w:r/>
+    </w:p>
+    <w:p>
+      <w:pPr>
+        <w:pBdr/>
+        <w:spacing/>
+        <w:ind w:firstLine="0" w:left="0"/>
+        <w:rPr/>
+      </w:pPr>
+      <w:r/>
+      <w:r/>
+      <w:r/>
+    </w:p>
+    <w:p>
+      <w:pPr>
+        <w:pBdr/>
+        <w:spacing/>
+        <w:ind w:firstLine="0" w:left="0"/>
+        <w:rPr/>
+      </w:pPr>
+      <w:r/>
+      <w:r/>
+      <w:r/>
+    </w:p>
+    <w:p>
+      <w:pPr>
+        <w:pBdr/>
+        <w:spacing/>
+        <w:ind w:firstLine="0" w:left="0"/>
+        <w:rPr/>
+      </w:pPr>
+      <w:r/>
+      <w:r/>
+      <w:r/>
+    </w:p>
+    <w:p>
+      <w:pPr>
+        <w:pBdr/>
+        <w:spacing/>
+        <w:ind w:firstLine="0" w:left="0"/>
+        <w:rPr/>
+      </w:pPr>
+      <w:r/>
+      <w:r/>
+      <w:r/>
+    </w:p>
+    <w:p>
+      <w:pPr>
+        <w:pBdr>
+          <w:top w:val="none" w:color="000000" w:sz="4" w:space="0"/>
+          <w:left w:val="none" w:color="000000" w:sz="4" w:space="0"/>
+          <w:bottom w:val="none" w:color="000000" w:sz="4" w:space="0"/>
+          <w:right w:val="none" w:color="000000" w:sz="4" w:space="0"/>
+        </w:pBdr>
+        <w:shd w:val="clear" w:color="121314" w:fill="121314"/>
+        <w:spacing w:line="285" w:lineRule="atLeast"/>
+        <w:ind w:right="0" w:firstLine="0" w:left="0"/>
+        <w:rPr/>
       </w:pPr>
       <w:r>
         <w:rPr>
-          <w:highlight w:val="none"/>
+          <w:rFonts w:ascii="Droid Sans Mono" w:hAnsi="Droid Sans Mono" w:eastAsia="Droid Sans Mono" w:cs="Droid Sans Mono"/>
+          <w:color w:val="c586c0"/>
+          <w:sz w:val="21"/>
         </w:rPr>
-        <w:t xml:space="preserve">Ajouter une barre de recherche pour chercher dans l’historique une date précise</w:t>
+        <w:t xml:space="preserve">except</w:t>
       </w:r>
+      <w:r>
+        <w:rPr>
+          <w:rFonts w:ascii="Droid Sans Mono" w:hAnsi="Droid Sans Mono" w:eastAsia="Droid Sans Mono" w:cs="Droid Sans Mono"/>
+          <w:color w:val="bbbebf"/>
+          <w:sz w:val="21"/>
+        </w:rPr>
+        <w:t xml:space="preserve"> </w:t>
+      </w:r>
+      <w:r>
+        <w:rPr>
+          <w:rFonts w:ascii="Droid Sans Mono" w:hAnsi="Droid Sans Mono" w:eastAsia="Droid Sans Mono" w:cs="Droid Sans Mono"/>
+          <w:color w:val="4ec9b0"/>
+          <w:sz w:val="21"/>
+        </w:rPr>
+        <w:t xml:space="preserve">Exception</w:t>
+      </w:r>
+      <w:r>
+        <w:rPr>
+          <w:rFonts w:ascii="Droid Sans Mono" w:hAnsi="Droid Sans Mono" w:eastAsia="Droid Sans Mono" w:cs="Droid Sans Mono"/>
+          <w:color w:val="bbbebf"/>
+          <w:sz w:val="21"/>
+        </w:rPr>
+        <w:t xml:space="preserve"> </w:t>
+      </w:r>
+      <w:r>
+        <w:rPr>
+          <w:rFonts w:ascii="Droid Sans Mono" w:hAnsi="Droid Sans Mono" w:eastAsia="Droid Sans Mono" w:cs="Droid Sans Mono"/>
+          <w:color w:val="c586c0"/>
+          <w:sz w:val="21"/>
+        </w:rPr>
+        <w:t xml:space="preserve">as</w:t>
+      </w:r>
+      <w:r>
+        <w:rPr>
+          <w:rFonts w:ascii="Droid Sans Mono" w:hAnsi="Droid Sans Mono" w:eastAsia="Droid Sans Mono" w:cs="Droid Sans Mono"/>
+          <w:color w:val="bbbebf"/>
+          <w:sz w:val="21"/>
+        </w:rPr>
+        <w:t xml:space="preserve"> </w:t>
+      </w:r>
+      <w:r>
+        <w:rPr>
+          <w:rFonts w:ascii="Droid Sans Mono" w:hAnsi="Droid Sans Mono" w:eastAsia="Droid Sans Mono" w:cs="Droid Sans Mono"/>
+          <w:color w:val="c9d1d9"/>
+          <w:sz w:val="21"/>
+        </w:rPr>
+        <w:t xml:space="preserve">e</w:t>
+      </w:r>
+      <w:r>
+        <w:rPr>
+          <w:rFonts w:ascii="Droid Sans Mono" w:hAnsi="Droid Sans Mono" w:eastAsia="Droid Sans Mono" w:cs="Droid Sans Mono"/>
+          <w:color w:val="bbbebf"/>
+          <w:sz w:val="21"/>
+        </w:rPr>
+        <w:t xml:space="preserve">:</w:t>
+      </w:r>
+      <w:r/>
+    </w:p>
+    <w:p>
+      <w:pPr>
+        <w:pBdr>
+          <w:top w:val="none" w:color="000000" w:sz="4" w:space="0"/>
+          <w:left w:val="none" w:color="000000" w:sz="4" w:space="0"/>
+          <w:bottom w:val="none" w:color="000000" w:sz="4" w:space="0"/>
+          <w:right w:val="none" w:color="000000" w:sz="4" w:space="0"/>
+        </w:pBdr>
+        <w:shd w:val="clear" w:color="121314" w:fill="121314"/>
+        <w:spacing w:line="285" w:lineRule="atLeast"/>
+        <w:ind w:right="0" w:firstLine="0" w:left="0"/>
+        <w:rPr/>
+      </w:pPr>
+      <w:r>
+        <w:rPr>
+          <w:rFonts w:ascii="Droid Sans Mono" w:hAnsi="Droid Sans Mono" w:eastAsia="Droid Sans Mono" w:cs="Droid Sans Mono"/>
+          <w:color w:val="bbbebf"/>
+          <w:sz w:val="21"/>
+        </w:rPr>
+        <w:t xml:space="preserve">        </w:t>
+      </w:r>
+      <w:r>
+        <w:rPr>
+          <w:rFonts w:ascii="Droid Sans Mono" w:hAnsi="Droid Sans Mono" w:eastAsia="Droid Sans Mono" w:cs="Droid Sans Mono"/>
+          <w:color w:val="d2a8ff"/>
+          <w:sz w:val="21"/>
+        </w:rPr>
+        <w:t xml:space="preserve">print</w:t>
+      </w:r>
+      <w:r>
+        <w:rPr>
+          <w:rFonts w:ascii="Droid Sans Mono" w:hAnsi="Droid Sans Mono" w:eastAsia="Droid Sans Mono" w:cs="Droid Sans Mono"/>
+          <w:color w:val="bbbebf"/>
+          <w:sz w:val="21"/>
+        </w:rPr>
+        <w:t xml:space="preserve">(</w:t>
+      </w:r>
+      <w:r>
+        <w:rPr>
+          <w:rFonts w:ascii="Droid Sans Mono" w:hAnsi="Droid Sans Mono" w:eastAsia="Droid Sans Mono" w:cs="Droid Sans Mono"/>
+          <w:color w:val="ff7b72"/>
+          <w:sz w:val="21"/>
+        </w:rPr>
+        <w:t xml:space="preserve">f</w:t>
+      </w:r>
+      <w:r>
+        <w:rPr>
+          <w:rFonts w:ascii="Droid Sans Mono" w:hAnsi="Droid Sans Mono" w:eastAsia="Droid Sans Mono" w:cs="Droid Sans Mono"/>
+          <w:color w:val="a5d6ff"/>
+          <w:sz w:val="21"/>
+        </w:rPr>
+        <w:t xml:space="preserve">"Erreur WebSocket inattendue: </w:t>
+      </w:r>
+      <w:r>
+        <w:rPr>
+          <w:rFonts w:ascii="Droid Sans Mono" w:hAnsi="Droid Sans Mono" w:eastAsia="Droid Sans Mono" w:cs="Droid Sans Mono"/>
+          <w:color w:val="ff7b72"/>
+          <w:sz w:val="21"/>
+        </w:rPr>
+        <w:t xml:space="preserve">{</w:t>
+      </w:r>
+      <w:r>
+        <w:rPr>
+          <w:rFonts w:ascii="Droid Sans Mono" w:hAnsi="Droid Sans Mono" w:eastAsia="Droid Sans Mono" w:cs="Droid Sans Mono"/>
+          <w:color w:val="c9d1d9"/>
+          <w:sz w:val="21"/>
+        </w:rPr>
+        <w:t xml:space="preserve">e</w:t>
+      </w:r>
+      <w:r>
+        <w:rPr>
+          <w:rFonts w:ascii="Droid Sans Mono" w:hAnsi="Droid Sans Mono" w:eastAsia="Droid Sans Mono" w:cs="Droid Sans Mono"/>
+          <w:color w:val="ff7b72"/>
+          <w:sz w:val="21"/>
+        </w:rPr>
+        <w:t xml:space="preserve">}</w:t>
+      </w:r>
+      <w:r>
+        <w:rPr>
+          <w:rFonts w:ascii="Droid Sans Mono" w:hAnsi="Droid Sans Mono" w:eastAsia="Droid Sans Mono" w:cs="Droid Sans Mono"/>
+          <w:color w:val="a5d6ff"/>
+          <w:sz w:val="21"/>
+        </w:rPr>
+        <w:t xml:space="preserve">"</w:t>
+      </w:r>
+      <w:r>
+        <w:rPr>
+          <w:rFonts w:ascii="Droid Sans Mono" w:hAnsi="Droid Sans Mono" w:eastAsia="Droid Sans Mono" w:cs="Droid Sans Mono"/>
+          <w:color w:val="bbbebf"/>
+          <w:sz w:val="21"/>
+        </w:rPr>
+        <w:t xml:space="preserve">)</w:t>
+      </w:r>
+      <w:r/>
+    </w:p>
+    <w:p>
+      <w:pPr>
+        <w:pBdr/>
+        <w:spacing/>
+        <w:ind w:firstLine="0" w:left="0"/>
+        <w:rPr/>
+      </w:pPr>
       <w:r>
         <w:rPr>
           <w:highlight w:val="none"/>
         </w:rPr>
       </w:r>
-    </w:p>
-    <w:p>
-      <w:pPr>
-        <w:pBdr/>
-        <w:spacing/>
-        <w:ind/>
-        <w:rPr/>
-      </w:pPr>
       <w:r>
         <w:rPr>
           <w:highlight w:val="none"/>
@@ -233,6 +871,311 @@
     </w:p>
   </w:footnote>
 </w:footnotes>
+</file>
+
+<file path=word/numbering.xml><?xml version="1.0" encoding="utf-8"?>
+<w:numbering xmlns:wpc="http://schemas.microsoft.com/office/word/2010/wordprocessingCanvas" xmlns:mc="http://schemas.openxmlformats.org/markup-compatibility/2006" xmlns:o="urn:schemas-microsoft-com:office:office" xmlns:r="http://schemas.openxmlformats.org/officeDocument/2006/relationships" xmlns:m="http://schemas.openxmlformats.org/officeDocument/2006/math" xmlns:v="urn:schemas-microsoft-com:vml" xmlns:wp14="http://schemas.microsoft.com/office/word/2010/wordprocessingDrawing" xmlns:wp="http://schemas.openxmlformats.org/drawingml/2006/wordprocessingDrawing" xmlns:w10="urn:schemas-microsoft-com:office:word" xmlns:w="http://schemas.openxmlformats.org/wordprocessingml/2006/main" xmlns:w14="http://schemas.microsoft.com/office/word/2010/wordml" xmlns:w15="http://schemas.microsoft.com/office/word/2012/wordml" xmlns:wpg="http://schemas.microsoft.com/office/word/2010/wordprocessingGroup" xmlns:wpi="http://schemas.microsoft.com/office/word/2010/wordprocessingInk" xmlns:wne="http://schemas.microsoft.com/office/word/2006/wordml" xmlns:wps="http://schemas.microsoft.com/office/word/2010/wordprocessingShape" mc:Ignorable="w14 w15 wp14">
+  <w:abstractNum w:abstractNumId="0">
+    <w:nsid w:val="01A494F3"/>
+    <w:lvl w:ilvl="0">
+      <w:isLgl w:val="false"/>
+      <w:lvlJc w:val="left"/>
+      <w:lvlText w:val="–"/>
+      <w:numFmt w:val="bullet"/>
+      <w:pPr>
+        <w:pBdr/>
+        <w:spacing/>
+        <w:ind w:hanging="360" w:left="709"/>
+      </w:pPr>
+      <w:rPr>
+        <w:rFonts w:hint="default" w:ascii="Arial" w:hAnsi="Arial" w:eastAsia="Arial" w:cs="Arial"/>
+      </w:rPr>
+      <w:start w:val="1"/>
+      <w:suff w:val="tab"/>
+    </w:lvl>
+    <w:lvl w:ilvl="1">
+      <w:isLgl w:val="false"/>
+      <w:lvlJc w:val="left"/>
+      <w:lvlText w:val="o"/>
+      <w:numFmt w:val="bullet"/>
+      <w:pPr>
+        <w:pBdr/>
+        <w:spacing/>
+        <w:ind w:hanging="360" w:left="1429"/>
+      </w:pPr>
+      <w:rPr>
+        <w:rFonts w:hint="default" w:ascii="Courier New" w:hAnsi="Courier New" w:eastAsia="Courier New" w:cs="Courier New"/>
+      </w:rPr>
+      <w:start w:val="1"/>
+      <w:suff w:val="tab"/>
+    </w:lvl>
+    <w:lvl w:ilvl="2">
+      <w:isLgl w:val="false"/>
+      <w:lvlJc w:val="left"/>
+      <w:lvlText w:val="§"/>
+      <w:numFmt w:val="bullet"/>
+      <w:pPr>
+        <w:pBdr/>
+        <w:spacing/>
+        <w:ind w:hanging="360" w:left="2149"/>
+      </w:pPr>
+      <w:rPr>
+        <w:rFonts w:hint="default" w:ascii="Wingdings" w:hAnsi="Wingdings" w:eastAsia="Wingdings" w:cs="Wingdings"/>
+      </w:rPr>
+      <w:start w:val="1"/>
+      <w:suff w:val="tab"/>
+    </w:lvl>
+    <w:lvl w:ilvl="3">
+      <w:isLgl w:val="false"/>
+      <w:lvlJc w:val="left"/>
+      <w:lvlText w:val="·"/>
+      <w:numFmt w:val="bullet"/>
+      <w:pPr>
+        <w:pBdr/>
+        <w:spacing/>
+        <w:ind w:hanging="360" w:left="2869"/>
+      </w:pPr>
+      <w:rPr>
+        <w:rFonts w:hint="default" w:ascii="Symbol" w:hAnsi="Symbol" w:eastAsia="Symbol" w:cs="Symbol"/>
+      </w:rPr>
+      <w:start w:val="1"/>
+      <w:suff w:val="tab"/>
+    </w:lvl>
+    <w:lvl w:ilvl="4">
+      <w:isLgl w:val="false"/>
+      <w:lvlJc w:val="left"/>
+      <w:lvlText w:val="o"/>
+      <w:numFmt w:val="bullet"/>
+      <w:pPr>
+        <w:pBdr/>
+        <w:spacing/>
+        <w:ind w:hanging="360" w:left="3589"/>
+      </w:pPr>
+      <w:rPr>
+        <w:rFonts w:hint="default" w:ascii="Courier New" w:hAnsi="Courier New" w:eastAsia="Courier New" w:cs="Courier New"/>
+      </w:rPr>
+      <w:start w:val="1"/>
+      <w:suff w:val="tab"/>
+    </w:lvl>
+    <w:lvl w:ilvl="5">
+      <w:isLgl w:val="false"/>
+      <w:lvlJc w:val="left"/>
+      <w:lvlText w:val="§"/>
+      <w:numFmt w:val="bullet"/>
+      <w:pPr>
+        <w:pBdr/>
+        <w:spacing/>
+        <w:ind w:hanging="360" w:left="4309"/>
+      </w:pPr>
+      <w:rPr>
+        <w:rFonts w:hint="default" w:ascii="Wingdings" w:hAnsi="Wingdings" w:eastAsia="Wingdings" w:cs="Wingdings"/>
+      </w:rPr>
+      <w:start w:val="1"/>
+      <w:suff w:val="tab"/>
+    </w:lvl>
+    <w:lvl w:ilvl="6">
+      <w:isLgl w:val="false"/>
+      <w:lvlJc w:val="left"/>
+      <w:lvlText w:val="·"/>
+      <w:numFmt w:val="bullet"/>
+      <w:pPr>
+        <w:pBdr/>
+        <w:spacing/>
+        <w:ind w:hanging="360" w:left="5029"/>
+      </w:pPr>
+      <w:rPr>
+        <w:rFonts w:hint="default" w:ascii="Symbol" w:hAnsi="Symbol" w:eastAsia="Symbol" w:cs="Symbol"/>
+      </w:rPr>
+      <w:start w:val="1"/>
+      <w:suff w:val="tab"/>
+    </w:lvl>
+    <w:lvl w:ilvl="7">
+      <w:isLgl w:val="false"/>
+      <w:lvlJc w:val="left"/>
+      <w:lvlText w:val="o"/>
+      <w:numFmt w:val="bullet"/>
+      <w:pPr>
+        <w:pBdr/>
+        <w:spacing/>
+        <w:ind w:hanging="360" w:left="5749"/>
+      </w:pPr>
+      <w:rPr>
+        <w:rFonts w:hint="default" w:ascii="Courier New" w:hAnsi="Courier New" w:eastAsia="Courier New" w:cs="Courier New"/>
+      </w:rPr>
+      <w:start w:val="1"/>
+      <w:suff w:val="tab"/>
+    </w:lvl>
+    <w:lvl w:ilvl="8">
+      <w:isLgl w:val="false"/>
+      <w:lvlJc w:val="left"/>
+      <w:lvlText w:val="§"/>
+      <w:numFmt w:val="bullet"/>
+      <w:pPr>
+        <w:pBdr/>
+        <w:spacing/>
+        <w:ind w:hanging="360" w:left="6469"/>
+      </w:pPr>
+      <w:rPr>
+        <w:rFonts w:hint="default" w:ascii="Wingdings" w:hAnsi="Wingdings" w:eastAsia="Wingdings" w:cs="Wingdings"/>
+      </w:rPr>
+      <w:start w:val="1"/>
+      <w:suff w:val="tab"/>
+    </w:lvl>
+  </w:abstractNum>
+  <w:abstractNum w:abstractNumId="1">
+    <w:nsid w:val="5F972395"/>
+    <w:lvl w:ilvl="0">
+      <w:isLgl w:val="false"/>
+      <w:lvlJc w:val="left"/>
+      <w:lvlText w:val="·"/>
+      <w:numFmt w:val="bullet"/>
+      <w:pPr>
+        <w:pBdr/>
+        <w:spacing/>
+        <w:ind w:hanging="360" w:left="709"/>
+      </w:pPr>
+      <w:rPr>
+        <w:rFonts w:hint="default" w:ascii="Symbol" w:hAnsi="Symbol" w:eastAsia="Symbol" w:cs="Symbol"/>
+      </w:rPr>
+      <w:start w:val="1"/>
+      <w:suff w:val="tab"/>
+    </w:lvl>
+    <w:lvl w:ilvl="1">
+      <w:isLgl w:val="false"/>
+      <w:lvlJc w:val="left"/>
+      <w:lvlText w:val="o"/>
+      <w:numFmt w:val="bullet"/>
+      <w:pPr>
+        <w:pBdr/>
+        <w:spacing/>
+        <w:ind w:hanging="360" w:left="1429"/>
+      </w:pPr>
+      <w:rPr>
+        <w:rFonts w:hint="default" w:ascii="Courier New" w:hAnsi="Courier New" w:eastAsia="Courier New" w:cs="Courier New"/>
+      </w:rPr>
+      <w:start w:val="1"/>
+      <w:suff w:val="tab"/>
+    </w:lvl>
+    <w:lvl w:ilvl="2">
+      <w:isLgl w:val="false"/>
+      <w:lvlJc w:val="left"/>
+      <w:lvlText w:val="§"/>
+      <w:numFmt w:val="bullet"/>
+      <w:pPr>
+        <w:pBdr/>
+        <w:spacing/>
+        <w:ind w:hanging="360" w:left="2149"/>
+      </w:pPr>
+      <w:rPr>
+        <w:rFonts w:hint="default" w:ascii="Wingdings" w:hAnsi="Wingdings" w:eastAsia="Wingdings" w:cs="Wingdings"/>
+      </w:rPr>
+      <w:start w:val="1"/>
+      <w:suff w:val="tab"/>
+    </w:lvl>
+    <w:lvl w:ilvl="3">
+      <w:isLgl w:val="false"/>
+      <w:lvlJc w:val="left"/>
+      <w:lvlText w:val="·"/>
+      <w:numFmt w:val="bullet"/>
+      <w:pPr>
+        <w:pBdr/>
+        <w:spacing/>
+        <w:ind w:hanging="360" w:left="2869"/>
+      </w:pPr>
+      <w:rPr>
+        <w:rFonts w:hint="default" w:ascii="Symbol" w:hAnsi="Symbol" w:eastAsia="Symbol" w:cs="Symbol"/>
+      </w:rPr>
+      <w:start w:val="1"/>
+      <w:suff w:val="tab"/>
+    </w:lvl>
+    <w:lvl w:ilvl="4">
+      <w:isLgl w:val="false"/>
+      <w:lvlJc w:val="left"/>
+      <w:lvlText w:val="o"/>
+      <w:numFmt w:val="bullet"/>
+      <w:pPr>
+        <w:pBdr/>
+        <w:spacing/>
+        <w:ind w:hanging="360" w:left="3589"/>
+      </w:pPr>
+      <w:rPr>
+        <w:rFonts w:hint="default" w:ascii="Courier New" w:hAnsi="Courier New" w:eastAsia="Courier New" w:cs="Courier New"/>
+      </w:rPr>
+      <w:start w:val="1"/>
+      <w:suff w:val="tab"/>
+    </w:lvl>
+    <w:lvl w:ilvl="5">
+      <w:isLgl w:val="false"/>
+      <w:lvlJc w:val="left"/>
+      <w:lvlText w:val="§"/>
+      <w:numFmt w:val="bullet"/>
+      <w:pPr>
+        <w:pBdr/>
+        <w:spacing/>
+        <w:ind w:hanging="360" w:left="4309"/>
+      </w:pPr>
+      <w:rPr>
+        <w:rFonts w:hint="default" w:ascii="Wingdings" w:hAnsi="Wingdings" w:eastAsia="Wingdings" w:cs="Wingdings"/>
+      </w:rPr>
+      <w:start w:val="1"/>
+      <w:suff w:val="tab"/>
+    </w:lvl>
+    <w:lvl w:ilvl="6">
+      <w:isLgl w:val="false"/>
+      <w:lvlJc w:val="left"/>
+      <w:lvlText w:val="·"/>
+      <w:numFmt w:val="bullet"/>
+      <w:pPr>
+        <w:pBdr/>
+        <w:spacing/>
+        <w:ind w:hanging="360" w:left="5029"/>
+      </w:pPr>
+      <w:rPr>
+        <w:rFonts w:hint="default" w:ascii="Symbol" w:hAnsi="Symbol" w:eastAsia="Symbol" w:cs="Symbol"/>
+      </w:rPr>
+      <w:start w:val="1"/>
+      <w:suff w:val="tab"/>
+    </w:lvl>
+    <w:lvl w:ilvl="7">
+      <w:isLgl w:val="false"/>
+      <w:lvlJc w:val="left"/>
+      <w:lvlText w:val="o"/>
+      <w:numFmt w:val="bullet"/>
+      <w:pPr>
+        <w:pBdr/>
+        <w:spacing/>
+        <w:ind w:hanging="360" w:left="5749"/>
+      </w:pPr>
+      <w:rPr>
+        <w:rFonts w:hint="default" w:ascii="Courier New" w:hAnsi="Courier New" w:eastAsia="Courier New" w:cs="Courier New"/>
+      </w:rPr>
+      <w:start w:val="1"/>
+      <w:suff w:val="tab"/>
+    </w:lvl>
+    <w:lvl w:ilvl="8">
+      <w:isLgl w:val="false"/>
+      <w:lvlJc w:val="left"/>
+      <w:lvlText w:val="§"/>
+      <w:numFmt w:val="bullet"/>
+      <w:pPr>
+        <w:pBdr/>
+        <w:spacing/>
+        <w:ind w:hanging="360" w:left="6469"/>
+      </w:pPr>
+      <w:rPr>
+        <w:rFonts w:hint="default" w:ascii="Wingdings" w:hAnsi="Wingdings" w:eastAsia="Wingdings" w:cs="Wingdings"/>
+      </w:rPr>
+      <w:start w:val="1"/>
+      <w:suff w:val="tab"/>
+    </w:lvl>
+  </w:abstractNum>
+  <w:num w:numId="1">
+    <w:abstractNumId w:val="0"/>
+  </w:num>
+  <w:num w:numId="2">
+    <w:abstractNumId w:val="1"/>
+  </w:num>
+</w:numbering>
 </file>
 
 <file path=word/styles.xml><?xml version="1.0" encoding="utf-8"?>

</xml_diff>